<commit_message>
feat: Command Center diagnosis: skills from the latest Progress Check (R/L/W/S, unentered parts ignored), home practice, combined status with reasons (Needs help / Watch / On track / Doing great), weak-skill filter, class skills panel with focus tip, data checks (XP mismatch, same name twice) and a pupil diagnosis drawer with next steps; older Unit 2 lessons (Moon Feast, First Harvest, Arcade Day, Forest Rangers, Swallow's Gift) and their lesson plans retimed to 35 minutes
Co-Authored-By: Claude Opus 5.5 <noreply@anthropic.com>
</commit_message>
<xml_diff>
--- a/lesson-plans/Grade3-Chuseok-Arcade-Day-Lesson-Plan.docx
+++ b/lesson-plans/Grade3-Chuseok-Arcade-Day-Lesson-Plan.docx
@@ -48,7 +48,7 @@
           <w:sz w:val="24"/>
           <w:szCs w:val="24"/>
         </w:rPr>
-        <w:t xml:space="preserve">Grade 3, Unit 2 "Thank You" · a 40-minute speaking lesson that checks the home project</w:t>
+        <w:t xml:space="preserve">Grade 3, Unit 2 "Thank You" · a 35-minute speaking lesson that checks the home project</w:t>
       </w:r>
     </w:p>
     <w:tbl>
@@ -470,7 +470,7 @@
                 <w:sz w:val="19"/>
                 <w:szCs w:val="19"/>
               </w:rPr>
-              <w:t xml:space="preserve">40 minutes (one lesson)</w:t>
+              <w:t xml:space="preserve">35 minutes (one lesson)</w:t>
             </w:r>
           </w:p>
         </w:tc>
@@ -647,7 +647,7 @@
           <w:sz w:val="21"/>
           <w:szCs w:val="21"/>
         </w:rPr>
-        <w:t xml:space="preserve">Visitor groups of about three move to the next station every three minutes, so each host welcomes several groups and each visitor plays at least three games in each round.</w:t>
+        <w:t xml:space="preserve">Visitor groups of about three move to the next station every two and a half minutes, so each host welcomes several groups and each visitor plays at least three games in each round.</w:t>
       </w:r>
     </w:p>
     <w:p>
@@ -1186,7 +1186,7 @@
           <w:sz w:val="26"/>
           <w:szCs w:val="26"/>
         </w:rPr>
-        <w:t xml:space="preserve">Procedure (40 minutes)</w:t>
+        <w:t xml:space="preserve">Procedure (35 minutes)</w:t>
       </w:r>
     </w:p>
     <w:tbl>
@@ -1413,7 +1413,7 @@
                 <w:sz w:val="19"/>
                 <w:szCs w:val="19"/>
               </w:rPr>
-              <w:t xml:space="preserve">5 min</w:t>
+              <w:t xml:space="preserve">4 min</w:t>
             </w:r>
           </w:p>
         </w:tc>
@@ -1581,7 +1581,7 @@
                 <w:sz w:val="19"/>
                 <w:szCs w:val="19"/>
               </w:rPr>
-              <w:t xml:space="preserve">9 min</w:t>
+              <w:t xml:space="preserve">8 min</w:t>
             </w:r>
           </w:p>
         </w:tc>
@@ -1654,7 +1654,7 @@
                 <w:sz w:val="19"/>
                 <w:szCs w:val="19"/>
               </w:rPr>
-              <w:t xml:space="preserve">Starts the 3-minute timer. At the bell, visitor groups move clockwise to the next station and the teacher starts the next 3 minutes (three station times). Walks around and listens; notes good hosting and cheering. Gives team points.</w:t>
+              <w:t xml:space="preserve">Starts the 2½-minute timer. At the bell, visitor groups move clockwise to the next station and the teacher starts the next 2½ minutes (three station times). Walks around and listens; notes good hosting and cheering. Gives team points.</w:t>
             </w:r>
           </w:p>
         </w:tc>
@@ -1749,7 +1749,7 @@
                 <w:sz w:val="19"/>
                 <w:szCs w:val="19"/>
               </w:rPr>
-              <w:t xml:space="preserve">9 min</w:t>
+              <w:t xml:space="preserve">8 min</w:t>
             </w:r>
           </w:p>
         </w:tc>
@@ -1917,7 +1917,7 @@
                 <w:sz w:val="19"/>
                 <w:szCs w:val="19"/>
               </w:rPr>
-              <w:t xml:space="preserve">9 min</w:t>
+              <w:t xml:space="preserve">7 min</w:t>
             </w:r>
           </w:p>
         </w:tc>

</xml_diff>